<commit_message>
docs(AOFP-198): add screens flow diagrams and tidy report 3/4 figures
</commit_message>
<xml_diff>
--- a/docs/review-2/source/SWP490_FA26SE036_R2_Registration_BM03.docx
+++ b/docs/review-2/source/SWP490_FA26SE036_R2_Registration_BM03.docx
@@ -34,22 +34,6 @@
           <w:szCs w:val="32"/>
         </w:rPr>
         <w:t xml:space="preserve">Registration Form – Record of Changes</w:t>
-      </w:r>
-    </w:p>
-    <w:p>
-      <w:pPr>
-        <w:spacing w:after="80"/>
-      </w:pPr>
-      <w:r>
-        <w:rPr>
-          <w:rFonts w:ascii="Calibri" w:cs="Calibri" w:eastAsia="Calibri" w:hAnsi="Calibri"/>
-          <w:i/>
-          <w:iCs/>
-          <w:color w:val="666666"/>
-          <w:sz w:val="19"/>
-          <w:szCs w:val="19"/>
-        </w:rPr>
-        <w:t xml:space="preserve">Form BM03. Attach to the proposed final registration form. The approved project code and title remain unchanged. Export to PDF together with the registration form. File name: SWP490_&lt;ProjectCode&gt;_R2_Registration.pdf</w:t>
       </w:r>
     </w:p>
     <w:p>
@@ -941,7 +925,7 @@
                 <w:sz w:val="16"/>
                 <w:szCs w:val="19"/>
               </w:rPr>
-              <w:t>3.1 Functional requirement – Order synchronization</w:t>
+              <w:t>3.1 Functional requirement – Order synchronization; 3.2 Proposed Tasks – package 2</w:t>
             </w:r>
           </w:p>
         </w:tc>
@@ -973,7 +957,7 @@
                 <w:sz w:val="16"/>
                 <w:szCs w:val="19"/>
               </w:rPr>
-              <w:t>Synchronize orders from Facebook Marketplace, TikTok Shop, Shopee, Lazada and Company Website (optional).</w:t>
+              <w:t>Synchronize orders from Facebook Marketplace, TikTok Shop, Shopee, Lazada and Company Website (optional): new orders, order updates, cancellations, customer information, product information, payment status and shipping status.</w:t>
             </w:r>
           </w:p>
         </w:tc>
@@ -1165,7 +1149,7 @@
                 <w:sz w:val="16"/>
                 <w:szCs w:val="19"/>
               </w:rPr>
-              <w:t>3.1 Dashboard &amp; Analytics – report export</w:t>
+              <w:t>3.1 Dashboard &amp; Analytics; 3.2 Proposed Tasks – package 5</w:t>
             </w:r>
           </w:p>
         </w:tc>
@@ -1553,7 +1537,7 @@
                 <w:sz w:val="16"/>
                 <w:szCs w:val="19"/>
               </w:rPr>
-              <w:t>3.2 System Actors – Store Owner</w:t>
+              <w:t>3.2 System Actors – Store Owner, System Administrator</w:t>
             </w:r>
           </w:p>
         </w:tc>
@@ -1687,22 +1671,6 @@
         </w:tc>
       </w:tr>
     </w:tbl>
-    <w:p>
-      <w:pPr>
-        <w:spacing w:after="80"/>
-      </w:pPr>
-      <w:r>
-        <w:rPr>
-          <w:rFonts w:ascii="Calibri" w:cs="Calibri" w:eastAsia="Calibri" w:hAnsi="Calibri"/>
-          <w:i/>
-          <w:iCs/>
-          <w:color w:val="666666"/>
-          <w:sz w:val="19"/>
-          <w:szCs w:val="19"/>
-        </w:rPr>
-        <w:t xml:space="preserve">Accepted reasons: Review 1 feedback, findings from Iteration 1, or constraints from data, partners or technology. Changes that significantly reduce business complexity must be fully justified.</w:t>
-      </w:r>
-    </w:p>
     <w:p>
       <w:pPr>
         <w:pStyle w:val="Heading2"/>

</xml_diff>